<commit_message>
feat(peticoes): novo tópico III no modelo de homologação
Adiciona o tópico "DO REGISTRO DO(S) INSTRUMENTO(S) DE CESSÃO DE CRÉDITO
PERANTE O REGISTRO DE TÍTULOS E DOCUMENTOS" entre o II (Comprovação) e
o atual III (Novos dados bancários).

Estrutura final:
  I    - Dispensa de Anuência (art. 290 CC)
  II   - Comprovação do Acordo
  III  - Registro do Instrumento (NOVO)
  IV   - Novos Dados Bancários (era III)
  V    - Troca de Titularidade no Alvará (era IV)
  VI   - Requerimentos (era V)

Placeholders permanecem os mesmos (6).

Setup pendente: re-upload de homologacao.docx no bucket.

Co-Authored-By: Claude Opus 4.7 (1M context) <noreply@anthropic.com>
</commit_message>
<xml_diff>
--- a/supabase/seeds/peticoes-templates/_modelo_original_homologacao.docx
+++ b/supabase/seeds/peticoes-templates/_modelo_original_homologacao.docx
@@ -544,33 +544,7 @@
           <w:rtl w:val="0"/>
         </w:rPr>
         <w:tab/>
-        <w:t xml:space="preserve">Conforme se extrai dos documentos ora acostados, o(a) peticionário(a) celebrou, em </w:t>
-      </w:r>
-      <w:r>
-        <w:fldChar w:fldCharType="begin"/>
-        <w:instrText xml:space="preserve"> DOCPROPERTY "[data do contrato]"</w:instrText>
-        <w:fldChar w:fldCharType="separate"/>
-      </w:r>
-      <w:r>
-        <w:rPr>
-          <w:rFonts w:ascii="Poppins" w:cs="Poppins" w:eastAsia="Poppins" w:hAnsi="Poppins"/>
-          <w:sz w:val="24"/>
-          <w:szCs w:val="24"/>
-          <w:rtl w:val="0"/>
-        </w:rPr>
-        <w:t xml:space="preserve">[data do contrato]</w:t>
-      </w:r>
-      <w:r>
-        <w:fldChar w:fldCharType="end"/>
-      </w:r>
-      <w:r>
-        <w:rPr>
-          <w:rFonts w:ascii="Poppins" w:cs="Poppins" w:eastAsia="Poppins" w:hAnsi="Poppins"/>
-          <w:sz w:val="24"/>
-          <w:szCs w:val="24"/>
-          <w:rtl w:val="0"/>
-        </w:rPr>
-        <w:t xml:space="preserve">, contrato(s) oneroso(s) de cessão de crédito judicial referente ao presente feito, por meio do qual assumiu a titularidade plena do</w:t>
+        <w:t xml:space="preserve">Conforme se extrai dos documentos ora acostados, o(a) peticionário(a) celebrou contrato(s) oneroso(s) de cessão de crédito judicial referente ao presente feito, por meio do qual assumiu a titularidade plena do</w:t>
       </w:r>
       <w:r>
         <w:rPr>
@@ -607,6 +581,18 @@
       <w:r>
         <w:rPr>
           <w:rFonts w:ascii="Poppins" w:cs="Poppins" w:eastAsia="Poppins" w:hAnsi="Poppins"/>
+          <w:b w:val="1"/>
+          <w:bCs w:val="1"/>
+          <w:sz w:val="24"/>
+          <w:szCs w:val="24"/>
+          <w:shd w:fill="fff2cc" w:val="clear"/>
+          <w:rtl w:val="0"/>
+        </w:rPr>
+        <w:t xml:space="preserve"> </w:t>
+      </w:r>
+      <w:r>
+        <w:rPr>
+          <w:rFonts w:ascii="Poppins" w:cs="Poppins" w:eastAsia="Poppins" w:hAnsi="Poppins"/>
           <w:sz w:val="24"/>
           <w:szCs w:val="24"/>
           <w:rtl w:val="0"/>
@@ -719,20 +705,178 @@
         <w:jc w:val="both"/>
         <w:rPr>
           <w:rFonts w:ascii="Poppins" w:cs="Poppins" w:eastAsia="Poppins" w:hAnsi="Poppins"/>
-          <w:sz w:val="24"/>
-          <w:szCs w:val="24"/>
-        </w:rPr>
-      </w:pPr>
-      <w:r>
-        <w:rPr>
-          <w:rFonts w:ascii="Poppins" w:cs="Poppins" w:eastAsia="Poppins" w:hAnsi="Poppins"/>
-          <w:b w:val="1"/>
-          <w:bCs w:val="1"/>
-          <w:sz w:val="24"/>
-          <w:szCs w:val="24"/>
-          <w:rtl w:val="0"/>
-        </w:rPr>
-        <w:t xml:space="preserve">III - NOVOS DADOS BANCÁRIOS EM RAZÃO DA CESSÃO DE CRÉDITO</w:t>
+          <w:b w:val="1"/>
+          <w:bCs w:val="1"/>
+          <w:sz w:val="24"/>
+          <w:szCs w:val="24"/>
+        </w:rPr>
+      </w:pPr>
+      <w:r>
+        <w:rPr>
+          <w:rFonts w:ascii="Poppins" w:cs="Poppins" w:eastAsia="Poppins" w:hAnsi="Poppins"/>
+          <w:b w:val="1"/>
+          <w:bCs w:val="1"/>
+          <w:sz w:val="24"/>
+          <w:szCs w:val="24"/>
+          <w:rtl w:val="0"/>
+        </w:rPr>
+        <w:t xml:space="preserve">III – DO REGISTRO DO(S) INSTRUMENTO(S) DE CESSÃO DE CRÉDITO PERANTE O REGISTRO DE TÍTULOS E DOCUMENTOS</w:t>
+      </w:r>
+    </w:p>
+    <w:p>
+      <w:pPr>
+        <w:spacing w:after="200" w:line="360" w:lineRule="auto"/>
+        <w:ind w:firstLine="720"/>
+        <w:jc w:val="both"/>
+        <w:rPr>
+          <w:rFonts w:ascii="Poppins" w:cs="Poppins" w:eastAsia="Poppins" w:hAnsi="Poppins"/>
+          <w:sz w:val="24"/>
+          <w:szCs w:val="24"/>
+          <w:u w:val="single"/>
+        </w:rPr>
+      </w:pPr>
+      <w:r>
+        <w:rPr>
+          <w:rFonts w:ascii="Poppins" w:cs="Poppins" w:eastAsia="Poppins" w:hAnsi="Poppins"/>
+          <w:sz w:val="24"/>
+          <w:szCs w:val="24"/>
+          <w:rtl w:val="0"/>
+        </w:rPr>
+        <w:t xml:space="preserve">Visando conferir publicidade e oponibilidade a terceiros ao(s) negócio(s) jurídico(s) ora noticiado(s), o(a) peticionário(a) já promoveu a abertura do protocolo de registro do(s) instrumento(s) de cessão de crédito perante o competente Cartório de Registro de Títulos e Documentos, nos termos do art. 129, item 10º, da Lei nº 6.015/1973 (redação dada pela Lei nº 14.382/2022), </w:t>
+      </w:r>
+      <w:r>
+        <w:rPr>
+          <w:rFonts w:ascii="Poppins" w:cs="Poppins" w:eastAsia="Poppins" w:hAnsi="Poppins"/>
+          <w:sz w:val="24"/>
+          <w:szCs w:val="24"/>
+          <w:u w:val="single"/>
+          <w:rtl w:val="0"/>
+        </w:rPr>
+        <w:t xml:space="preserve">cujo comprovante de protocolo segue anexo à presente manifestação.</w:t>
+      </w:r>
+    </w:p>
+    <w:p>
+      <w:pPr>
+        <w:spacing w:after="200" w:line="360" w:lineRule="auto"/>
+        <w:ind w:firstLine="720"/>
+        <w:jc w:val="both"/>
+        <w:rPr>
+          <w:rFonts w:ascii="Poppins" w:cs="Poppins" w:eastAsia="Poppins" w:hAnsi="Poppins"/>
+          <w:b w:val="1"/>
+          <w:bCs w:val="1"/>
+          <w:sz w:val="24"/>
+          <w:szCs w:val="24"/>
+          <w:shd w:fill="ffe599" w:val="clear"/>
+        </w:rPr>
+      </w:pPr>
+      <w:r>
+        <w:rPr>
+          <w:rFonts w:ascii="Poppins" w:cs="Poppins" w:eastAsia="Poppins" w:hAnsi="Poppins"/>
+          <w:sz w:val="24"/>
+          <w:szCs w:val="24"/>
+          <w:rtl w:val="0"/>
+        </w:rPr>
+        <w:t xml:space="preserve">O registro</w:t>
+      </w:r>
+      <w:r>
+        <w:rPr>
+          <w:rFonts w:ascii="Poppins" w:cs="Poppins" w:eastAsia="Poppins" w:hAnsi="Poppins"/>
+          <w:sz w:val="24"/>
+          <w:szCs w:val="24"/>
+          <w:rtl w:val="0"/>
+        </w:rPr>
+        <w:t xml:space="preserve"> encontra-se em regular tramitação perante a serventia extrajudicial, pendente tão somente da conclusão do procedimento. Dessa forma, </w:t>
+      </w:r>
+      <w:r>
+        <w:rPr>
+          <w:rFonts w:ascii="Poppins" w:cs="Poppins" w:eastAsia="Poppins" w:hAnsi="Poppins"/>
+          <w:sz w:val="24"/>
+          <w:szCs w:val="24"/>
+          <w:u w:val="single"/>
+          <w:rtl w:val="0"/>
+        </w:rPr>
+        <w:t xml:space="preserve">compromete-se o(a) peticionário(a) a carrear aos autos a respectiva certidão/instrumento devidamente registrado tão logo haja o retorno por parte do cartório</w:t>
+      </w:r>
+      <w:r>
+        <w:rPr>
+          <w:rFonts w:ascii="Poppins" w:cs="Poppins" w:eastAsia="Poppins" w:hAnsi="Poppins"/>
+          <w:sz w:val="24"/>
+          <w:szCs w:val="24"/>
+          <w:rtl w:val="0"/>
+        </w:rPr>
+        <w:t xml:space="preserve">, independentemente de nova intimação, </w:t>
+      </w:r>
+      <w:r>
+        <w:rPr>
+          <w:rFonts w:ascii="Poppins" w:cs="Poppins" w:eastAsia="Poppins" w:hAnsi="Poppins"/>
+          <w:b w:val="1"/>
+          <w:bCs w:val="1"/>
+          <w:sz w:val="24"/>
+          <w:szCs w:val="24"/>
+          <w:shd w:fill="ffe599" w:val="clear"/>
+          <w:rtl w:val="0"/>
+        </w:rPr>
+        <w:t xml:space="preserve">restando, desde já, demonstrada</w:t>
+      </w:r>
+      <w:r>
+        <w:rPr>
+          <w:rFonts w:ascii="Poppins" w:cs="Poppins" w:eastAsia="Poppins" w:hAnsi="Poppins"/>
+          <w:sz w:val="24"/>
+          <w:szCs w:val="24"/>
+          <w:shd w:fill="ffe599" w:val="clear"/>
+          <w:rtl w:val="0"/>
+        </w:rPr>
+        <w:t xml:space="preserve"> —</w:t>
+      </w:r>
+      <w:r>
+        <w:rPr>
+          <w:rFonts w:ascii="Poppins" w:cs="Poppins" w:eastAsia="Poppins" w:hAnsi="Poppins"/>
+          <w:b w:val="1"/>
+          <w:bCs w:val="1"/>
+          <w:sz w:val="24"/>
+          <w:szCs w:val="24"/>
+          <w:shd w:fill="ffe599" w:val="clear"/>
+          <w:rtl w:val="0"/>
+        </w:rPr>
+        <w:t xml:space="preserve"> por meio do protocolo anexo — a adoção das medidas tendentes à formalização e à publicidade da(s) cessão(ões) de crédito celebrada(s).</w:t>
+      </w:r>
+    </w:p>
+    <w:p>
+      <w:pPr>
+        <w:spacing w:after="200" w:line="360" w:lineRule="auto"/>
+        <w:jc w:val="both"/>
+        <w:rPr>
+          <w:rFonts w:ascii="Poppins" w:cs="Poppins" w:eastAsia="Poppins" w:hAnsi="Poppins"/>
+          <w:sz w:val="24"/>
+          <w:szCs w:val="24"/>
+        </w:rPr>
+      </w:pPr>
+      <w:r>
+        <w:rPr>
+          <w:rtl w:val="0"/>
+        </w:rPr>
+      </w:r>
+    </w:p>
+    <w:p>
+      <w:pPr>
+        <w:spacing w:after="200" w:line="360" w:lineRule="auto"/>
+        <w:jc w:val="both"/>
+        <w:rPr>
+          <w:rFonts w:ascii="Poppins" w:cs="Poppins" w:eastAsia="Poppins" w:hAnsi="Poppins"/>
+          <w:sz w:val="24"/>
+          <w:szCs w:val="24"/>
+        </w:rPr>
+      </w:pPr>
+      <w:r>
+        <w:rPr>
+          <w:rFonts w:ascii="Poppins" w:cs="Poppins" w:eastAsia="Poppins" w:hAnsi="Poppins"/>
+          <w:b w:val="1"/>
+          <w:bCs w:val="1"/>
+          <w:sz w:val="24"/>
+          <w:szCs w:val="24"/>
+          <w:rtl w:val="0"/>
+        </w:rPr>
+        <w:t xml:space="preserve">IV - NOVOS DADOS BANCÁRIOS EM RAZÃO DA CESSÃO DE CRÉDITO</w:t>
       </w:r>
       <w:r>
         <w:rPr>
@@ -878,7 +1022,7 @@
           <w:szCs w:val="24"/>
           <w:rtl w:val="0"/>
         </w:rPr>
-        <w:t xml:space="preserve">IV – DA TROCA DE TITULARIDADE DO CRÉDITO NO ALVARÁ DE LEVANTAMENTO</w:t>
+        <w:t xml:space="preserve">V – DA TROCA DE TITULARIDADE DO CRÉDITO NO ALVARÁ DE LEVANTAMENTO</w:t>
       </w:r>
       <w:r>
         <w:rPr>
@@ -1058,7 +1202,7 @@
           <w:szCs w:val="24"/>
           <w:rtl w:val="0"/>
         </w:rPr>
-        <w:t xml:space="preserve">V - REQUERIMENTOS</w:t>
+        <w:t xml:space="preserve">VI - REQUERIMENTOS</w:t>
       </w:r>
     </w:p>
     <w:p>

</xml_diff>